<commit_message>
Submission files: equation numbers, bordered tables and A4 in the Word files; cover letter for JCLEPRO
Co-Authored-By: Claude Sonnet 5.5 <noreply@anthropic.com>
</commit_message>
<xml_diff>
--- a/05_Drafts/manuscript/SUPPLEMENTARY_MATERIAL.docx
+++ b/05_Drafts/manuscript/SUPPLEMENTARY_MATERIAL.docx
@@ -1071,6 +1071,9 @@
               </m:r>
             </m:e>
           </m:d>
+          <m:r>
+            <m:t xml:space="preserve">  (S1)</m:t>
+          </m:r>
         </m:oMath>
       </m:oMathPara>
     </w:p>
@@ -1767,6 +1770,9 @@
               </m:m>
             </m:e>
           </m:d>
+          <m:r>
+            <m:t xml:space="preserve">  (S2)</m:t>
+          </m:r>
         </m:oMath>
       </m:oMathPara>
     </w:p>
@@ -1925,6 +1931,9 @@
               </m:sSub>
             </m:den>
           </m:f>
+          <m:r>
+            <m:t xml:space="preserve">  (S3)</m:t>
+          </m:r>
         </m:oMath>
       </m:oMathPara>
     </w:p>
@@ -2034,6 +2043,9 @@
               </m:r>
             </m:sub>
           </m:sSub>
+          <m:r>
+            <m:t xml:space="preserve">  (S4)</m:t>
+          </m:r>
         </m:oMath>
       </m:oMathPara>
     </w:p>
@@ -2171,6 +2183,9 @@
               </m:r>
             </m:sub>
           </m:sSub>
+          <m:r>
+            <m:t xml:space="preserve">  (S5)</m:t>
+          </m:r>
         </m:oMath>
       </m:oMathPara>
     </w:p>
@@ -2472,6 +2487,9 @@
               </m:r>
             </m:den>
           </m:f>
+          <m:r>
+            <m:t xml:space="preserve">  (S6)</m:t>
+          </m:r>
         </m:oMath>
       </m:oMathPara>
     </w:p>
@@ -2822,6 +2840,9 @@
               </m:sSup>
             </m:den>
           </m:f>
+          <m:r>
+            <m:t xml:space="preserve">  (S7)</m:t>
+          </m:r>
         </m:oMath>
       </m:oMathPara>
     </w:p>
@@ -3089,6 +3110,9 @@
               </m:sSub>
             </m:e>
           </m:d>
+          <m:r>
+            <m:t xml:space="preserve">  (S8)</m:t>
+          </m:r>
         </m:oMath>
       </m:oMathPara>
     </w:p>
@@ -3349,6 +3373,9 @@
               </m:r>
             </m:sub>
           </m:sSub>
+          <m:r>
+            <m:t xml:space="preserve">  (S9)</m:t>
+          </m:r>
         </m:oMath>
       </m:oMathPara>
     </w:p>
@@ -3597,6 +3624,9 @@
               <m:sty m:val="p"/>
             </m:rPr>
             <m:t>)</m:t>
+          </m:r>
+          <m:r>
+            <m:t xml:space="preserve">  (S10)</m:t>
           </m:r>
         </m:oMath>
       </m:oMathPara>
@@ -3943,6 +3973,9 @@
               </m:sSubSup>
             </m:e>
           </m:d>
+          <m:r>
+            <m:t xml:space="preserve">  (S11)</m:t>
+          </m:r>
         </m:oMath>
       </m:oMathPara>
     </w:p>
@@ -4186,6 +4219,9 @@
               </m:f>
             </m:e>
           </m:d>
+          <m:r>
+            <m:t xml:space="preserve">  (S12)</m:t>
+          </m:r>
         </m:oMath>
       </m:oMathPara>
     </w:p>
@@ -4339,6 +4375,11 @@
       <w:tblPr>
         <w:tblStyle w:val="Table"/>
         <w:tblW w:type="pct" w:w="5000"/>
+        <w:tblBorders>
+          <w:top w:val="single" w:sz="8" w:space="0" w:color="000000"/>
+          <w:bottom w:val="single" w:sz="8" w:space="0" w:color="000000"/>
+          <w:insideH w:val="single" w:sz="2" w:space="0" w:color="999999"/>
+        </w:tblBorders>
         <w:tblLayout w:type="fixed"/>
         <w:tblLook w:firstRow="1" w:lastRow="0" w:firstColumn="0" w:lastColumn="0" w:noHBand="0" w:noVBand="0" w:val="0020"/>
       </w:tblPr>
@@ -4361,6 +4402,10 @@
               <w:pStyle w:val="Compact"/>
             </w:pPr>
             <w:r>
+              <w:rPr>
+                <w:sz w:val="16"/>
+                <w:szCs w:val="16"/>
+              </w:rPr>
               <w:t xml:space="preserve">Candidate Algorithm</w:t>
             </w:r>
           </w:p>
@@ -4372,6 +4417,10 @@
               <w:pStyle w:val="Compact"/>
             </w:pPr>
             <w:r>
+              <w:rPr>
+                <w:sz w:val="16"/>
+                <w:szCs w:val="16"/>
+              </w:rPr>
               <w:t xml:space="preserve">Geodesic (16 m): mean best penalized weight [kN] (rank, best pop)</w:t>
             </w:r>
           </w:p>
@@ -4383,6 +4432,10 @@
               <w:pStyle w:val="Compact"/>
             </w:pPr>
             <w:r>
+              <w:rPr>
+                <w:sz w:val="16"/>
+                <w:szCs w:val="16"/>
+              </w:rPr>
               <w:t xml:space="preserve">Kiewitt (32 m): mean best penalized weight [kN] (rank, best pop)</w:t>
             </w:r>
           </w:p>
@@ -4394,6 +4447,10 @@
               <w:pStyle w:val="Compact"/>
             </w:pPr>
             <w:r>
+              <w:rPr>
+                <w:sz w:val="16"/>
+                <w:szCs w:val="16"/>
+              </w:rPr>
               <w:t xml:space="preserve">Ribbed (40 m): mean best penalized weight [kN] (rank, best pop)</w:t>
             </w:r>
           </w:p>
@@ -4405,6 +4462,10 @@
               <w:pStyle w:val="Compact"/>
             </w:pPr>
             <w:r>
+              <w:rPr>
+                <w:sz w:val="16"/>
+                <w:szCs w:val="16"/>
+              </w:rPr>
               <w:t xml:space="preserve">Mean rank</w:t>
             </w:r>
           </w:p>
@@ -4416,6 +4477,10 @@
               <w:pStyle w:val="Compact"/>
             </w:pPr>
             <w:r>
+              <w:rPr>
+                <w:sz w:val="16"/>
+                <w:szCs w:val="16"/>
+              </w:rPr>
               <w:t xml:space="preserve">Selected for Campaign</w:t>
             </w:r>
           </w:p>
@@ -4429,6 +4494,10 @@
               <w:pStyle w:val="Compact"/>
             </w:pPr>
             <w:r>
+              <w:rPr>
+                <w:sz w:val="16"/>
+                <w:szCs w:val="16"/>
+              </w:rPr>
               <w:t xml:space="preserve">ABC</w:t>
             </w:r>
           </w:p>
@@ -4440,6 +4509,10 @@
               <w:pStyle w:val="Compact"/>
             </w:pPr>
             <w:r>
+              <w:rPr>
+                <w:sz w:val="16"/>
+                <w:szCs w:val="16"/>
+              </w:rPr>
               <w:t xml:space="preserve">5.894 (1, pop 20)</w:t>
             </w:r>
           </w:p>
@@ -4451,6 +4524,10 @@
               <w:pStyle w:val="Compact"/>
             </w:pPr>
             <w:r>
+              <w:rPr>
+                <w:sz w:val="16"/>
+                <w:szCs w:val="16"/>
+              </w:rPr>
               <w:t xml:space="preserve">41.058 (1, pop 20)</w:t>
             </w:r>
           </w:p>
@@ -4462,6 +4539,10 @@
               <w:pStyle w:val="Compact"/>
             </w:pPr>
             <w:r>
+              <w:rPr>
+                <w:sz w:val="16"/>
+                <w:szCs w:val="16"/>
+              </w:rPr>
               <w:t xml:space="preserve">66.359 (1, pop 40)</w:t>
             </w:r>
           </w:p>
@@ -4473,6 +4554,10 @@
               <w:pStyle w:val="Compact"/>
             </w:pPr>
             <w:r>
+              <w:rPr>
+                <w:sz w:val="16"/>
+                <w:szCs w:val="16"/>
+              </w:rPr>
               <w:t xml:space="preserve">1.00</w:t>
             </w:r>
           </w:p>
@@ -4487,6 +4572,8 @@
               <w:rPr>
                 <w:b/>
                 <w:bCs/>
+                <w:sz w:val="16"/>
+                <w:szCs w:val="16"/>
               </w:rPr>
               <w:t xml:space="preserve">Yes</w:t>
             </w:r>
@@ -4501,6 +4588,10 @@
               <w:pStyle w:val="Compact"/>
             </w:pPr>
             <w:r>
+              <w:rPr>
+                <w:sz w:val="16"/>
+                <w:szCs w:val="16"/>
+              </w:rPr>
               <w:t xml:space="preserve">ACO</w:t>
             </w:r>
           </w:p>
@@ -4512,6 +4603,10 @@
               <w:pStyle w:val="Compact"/>
             </w:pPr>
             <w:r>
+              <w:rPr>
+                <w:sz w:val="16"/>
+                <w:szCs w:val="16"/>
+              </w:rPr>
               <w:t xml:space="preserve">6.111 (2, pop 80)</w:t>
             </w:r>
           </w:p>
@@ -4523,6 +4618,10 @@
               <w:pStyle w:val="Compact"/>
             </w:pPr>
             <w:r>
+              <w:rPr>
+                <w:sz w:val="16"/>
+                <w:szCs w:val="16"/>
+              </w:rPr>
               <w:t xml:space="preserve">41.956 (2, pop 20)</w:t>
             </w:r>
           </w:p>
@@ -4534,6 +4633,10 @@
               <w:pStyle w:val="Compact"/>
             </w:pPr>
             <w:r>
+              <w:rPr>
+                <w:sz w:val="16"/>
+                <w:szCs w:val="16"/>
+              </w:rPr>
               <w:t xml:space="preserve">66.592 (2, pop 80)</w:t>
             </w:r>
           </w:p>
@@ -4545,6 +4648,10 @@
               <w:pStyle w:val="Compact"/>
             </w:pPr>
             <w:r>
+              <w:rPr>
+                <w:sz w:val="16"/>
+                <w:szCs w:val="16"/>
+              </w:rPr>
               <w:t xml:space="preserve">2.00</w:t>
             </w:r>
           </w:p>
@@ -4559,6 +4666,8 @@
               <w:rPr>
                 <w:b/>
                 <w:bCs/>
+                <w:sz w:val="16"/>
+                <w:szCs w:val="16"/>
               </w:rPr>
               <w:t xml:space="preserve">Yes</w:t>
             </w:r>
@@ -4573,6 +4682,10 @@
               <w:pStyle w:val="Compact"/>
             </w:pPr>
             <w:r>
+              <w:rPr>
+                <w:sz w:val="16"/>
+                <w:szCs w:val="16"/>
+              </w:rPr>
               <w:t xml:space="preserve">DO</w:t>
             </w:r>
           </w:p>
@@ -4584,6 +4697,10 @@
               <w:pStyle w:val="Compact"/>
             </w:pPr>
             <w:r>
+              <w:rPr>
+                <w:sz w:val="16"/>
+                <w:szCs w:val="16"/>
+              </w:rPr>
               <w:t xml:space="preserve">6.426 (4, pop 40)</w:t>
             </w:r>
           </w:p>
@@ -4595,6 +4712,10 @@
               <w:pStyle w:val="Compact"/>
             </w:pPr>
             <w:r>
+              <w:rPr>
+                <w:sz w:val="16"/>
+                <w:szCs w:val="16"/>
+              </w:rPr>
               <w:t xml:space="preserve">42.769 (3, pop 80)</w:t>
             </w:r>
           </w:p>
@@ -4606,6 +4727,10 @@
               <w:pStyle w:val="Compact"/>
             </w:pPr>
             <w:r>
+              <w:rPr>
+                <w:sz w:val="16"/>
+                <w:szCs w:val="16"/>
+              </w:rPr>
               <w:t xml:space="preserve">73.652 (3, pop 40)</w:t>
             </w:r>
           </w:p>
@@ -4617,6 +4742,10 @@
               <w:pStyle w:val="Compact"/>
             </w:pPr>
             <w:r>
+              <w:rPr>
+                <w:sz w:val="16"/>
+                <w:szCs w:val="16"/>
+              </w:rPr>
               <w:t xml:space="preserve">3.33</w:t>
             </w:r>
           </w:p>
@@ -4631,6 +4760,8 @@
               <w:rPr>
                 <w:b/>
                 <w:bCs/>
+                <w:sz w:val="16"/>
+                <w:szCs w:val="16"/>
               </w:rPr>
               <w:t xml:space="preserve">Yes (recent benchmark)</w:t>
             </w:r>
@@ -4645,6 +4776,10 @@
               <w:pStyle w:val="Compact"/>
             </w:pPr>
             <w:r>
+              <w:rPr>
+                <w:sz w:val="16"/>
+                <w:szCs w:val="16"/>
+              </w:rPr>
               <w:t xml:space="preserve">GWO</w:t>
             </w:r>
           </w:p>
@@ -4656,6 +4791,10 @@
               <w:pStyle w:val="Compact"/>
             </w:pPr>
             <w:r>
+              <w:rPr>
+                <w:sz w:val="16"/>
+                <w:szCs w:val="16"/>
+              </w:rPr>
               <w:t xml:space="preserve">6.221 (3, pop 80)</w:t>
             </w:r>
           </w:p>
@@ -4667,6 +4806,10 @@
               <w:pStyle w:val="Compact"/>
             </w:pPr>
             <w:r>
+              <w:rPr>
+                <w:sz w:val="16"/>
+                <w:szCs w:val="16"/>
+              </w:rPr>
               <w:t xml:space="preserve">43.828 (5, pop 80)</w:t>
             </w:r>
           </w:p>
@@ -4678,6 +4821,10 @@
               <w:pStyle w:val="Compact"/>
             </w:pPr>
             <w:r>
+              <w:rPr>
+                <w:sz w:val="16"/>
+                <w:szCs w:val="16"/>
+              </w:rPr>
               <w:t xml:space="preserve">not run</w:t>
             </w:r>
           </w:p>
@@ -4689,6 +4836,10 @@
               <w:pStyle w:val="Compact"/>
             </w:pPr>
             <w:r>
+              <w:rPr>
+                <w:sz w:val="16"/>
+                <w:szCs w:val="16"/>
+              </w:rPr>
               <w:t xml:space="preserve">4.00</w:t>
             </w:r>
           </w:p>
@@ -4700,6 +4851,10 @@
               <w:pStyle w:val="Compact"/>
             </w:pPr>
             <w:r>
+              <w:rPr>
+                <w:sz w:val="16"/>
+                <w:szCs w:val="16"/>
+              </w:rPr>
               <w:t xml:space="preserve">No</w:t>
             </w:r>
           </w:p>
@@ -4713,6 +4868,10 @@
               <w:pStyle w:val="Compact"/>
             </w:pPr>
             <w:r>
+              <w:rPr>
+                <w:sz w:val="16"/>
+                <w:szCs w:val="16"/>
+              </w:rPr>
               <w:t xml:space="preserve">WOA</w:t>
             </w:r>
           </w:p>
@@ -4724,6 +4883,10 @@
               <w:pStyle w:val="Compact"/>
             </w:pPr>
             <w:r>
+              <w:rPr>
+                <w:sz w:val="16"/>
+                <w:szCs w:val="16"/>
+              </w:rPr>
               <w:t xml:space="preserve">6.511 (5, pop 80)</w:t>
             </w:r>
           </w:p>
@@ -4735,6 +4898,10 @@
               <w:pStyle w:val="Compact"/>
             </w:pPr>
             <w:r>
+              <w:rPr>
+                <w:sz w:val="16"/>
+                <w:szCs w:val="16"/>
+              </w:rPr>
               <w:t xml:space="preserve">43.128 (4, pop 40)</w:t>
             </w:r>
           </w:p>
@@ -4746,6 +4913,10 @@
               <w:pStyle w:val="Compact"/>
             </w:pPr>
             <w:r>
+              <w:rPr>
+                <w:sz w:val="16"/>
+                <w:szCs w:val="16"/>
+              </w:rPr>
               <w:t xml:space="preserve">not run</w:t>
             </w:r>
           </w:p>
@@ -4757,6 +4928,10 @@
               <w:pStyle w:val="Compact"/>
             </w:pPr>
             <w:r>
+              <w:rPr>
+                <w:sz w:val="16"/>
+                <w:szCs w:val="16"/>
+              </w:rPr>
               <w:t xml:space="preserve">4.50</w:t>
             </w:r>
           </w:p>
@@ -4768,6 +4943,10 @@
               <w:pStyle w:val="Compact"/>
             </w:pPr>
             <w:r>
+              <w:rPr>
+                <w:sz w:val="16"/>
+                <w:szCs w:val="16"/>
+              </w:rPr>
               <w:t xml:space="preserve">No</w:t>
             </w:r>
           </w:p>
@@ -4781,6 +4960,10 @@
               <w:pStyle w:val="Compact"/>
             </w:pPr>
             <w:r>
+              <w:rPr>
+                <w:sz w:val="16"/>
+                <w:szCs w:val="16"/>
+              </w:rPr>
               <w:t xml:space="preserve">TLBO</w:t>
             </w:r>
           </w:p>
@@ -4792,6 +4975,10 @@
               <w:pStyle w:val="Compact"/>
             </w:pPr>
             <w:r>
+              <w:rPr>
+                <w:sz w:val="16"/>
+                <w:szCs w:val="16"/>
+              </w:rPr>
               <w:t xml:space="preserve">7.264 (6, pop 80)</w:t>
             </w:r>
           </w:p>
@@ -4803,6 +4990,10 @@
               <w:pStyle w:val="Compact"/>
             </w:pPr>
             <w:r>
+              <w:rPr>
+                <w:sz w:val="16"/>
+                <w:szCs w:val="16"/>
+              </w:rPr>
               <w:t xml:space="preserve">83.226 (6, pop 80)</w:t>
             </w:r>
           </w:p>
@@ -4814,6 +5005,10 @@
               <w:pStyle w:val="Compact"/>
             </w:pPr>
             <w:r>
+              <w:rPr>
+                <w:sz w:val="16"/>
+                <w:szCs w:val="16"/>
+              </w:rPr>
               <w:t xml:space="preserve">not run</w:t>
             </w:r>
           </w:p>
@@ -4825,6 +5020,10 @@
               <w:pStyle w:val="Compact"/>
             </w:pPr>
             <w:r>
+              <w:rPr>
+                <w:sz w:val="16"/>
+                <w:szCs w:val="16"/>
+              </w:rPr>
               <w:t xml:space="preserve">6.00</w:t>
             </w:r>
           </w:p>
@@ -4836,6 +5035,10 @@
               <w:pStyle w:val="Compact"/>
             </w:pPr>
             <w:r>
+              <w:rPr>
+                <w:sz w:val="16"/>
+                <w:szCs w:val="16"/>
+              </w:rPr>
               <w:t xml:space="preserve">No</w:t>
             </w:r>
           </w:p>
@@ -5183,6 +5386,9 @@
               </m:sSubSup>
             </m:e>
           </m:nary>
+          <m:r>
+            <m:t xml:space="preserve">  (S13)</m:t>
+          </m:r>
         </m:oMath>
       </m:oMathPara>
     </w:p>
@@ -5409,6 +5615,9 @@
               </m:f>
             </m:e>
           </m:d>
+          <m:r>
+            <m:t xml:space="preserve">  (S14)</m:t>
+          </m:r>
         </m:oMath>
       </m:oMathPara>
     </w:p>
@@ -5787,6 +5996,9 @@
             </m:rPr>
             <m:t>)</m:t>
           </m:r>
+          <m:r>
+            <m:t xml:space="preserve">  (S15)</m:t>
+          </m:r>
         </m:oMath>
       </m:oMathPara>
     </w:p>
@@ -5998,6 +6210,9 @@
               </m:r>
             </m:den>
           </m:f>
+          <m:r>
+            <m:t xml:space="preserve">  (S16)</m:t>
+          </m:r>
         </m:oMath>
       </m:oMathPara>
     </w:p>
@@ -6321,6 +6536,9 @@
               </m:sSub>
             </m:den>
           </m:f>
+          <m:r>
+            <m:t xml:space="preserve">  (S17)</m:t>
+          </m:r>
         </m:oMath>
       </m:oMathPara>
     </w:p>
@@ -6650,6 +6868,9 @@
               </m:r>
             </m:den>
           </m:f>
+          <m:r>
+            <m:t xml:space="preserve">  (S18)</m:t>
+          </m:r>
         </m:oMath>
       </m:oMathPara>
     </w:p>
@@ -7256,6 +7477,9 @@
               </m:f>
             </m:e>
           </m:rad>
+          <m:r>
+            <m:t xml:space="preserve">  (S19)</m:t>
+          </m:r>
         </m:oMath>
       </m:oMathPara>
     </w:p>
@@ -7457,6 +7681,9 @@
               </m:r>
             </m:den>
           </m:f>
+          <m:r>
+            <m:t xml:space="preserve">  (S20)</m:t>
+          </m:r>
         </m:oMath>
       </m:oMathPara>
     </w:p>
@@ -7869,6 +8096,9 @@
               </m:r>
             </m:sub>
           </m:sSub>
+          <m:r>
+            <m:t xml:space="preserve">  (S21)</m:t>
+          </m:r>
         </m:oMath>
       </m:oMathPara>
     </w:p>
@@ -8310,6 +8540,9 @@
               </m:r>
             </m:e>
           </m:d>
+          <m:r>
+            <m:t xml:space="preserve">  (S22)</m:t>
+          </m:r>
         </m:oMath>
       </m:oMathPara>
     </w:p>
@@ -8747,6 +8980,11 @@
       <w:tblPr>
         <w:tblStyle w:val="Table"/>
         <w:tblW w:type="pct" w:w="5000"/>
+        <w:tblBorders>
+          <w:top w:val="single" w:sz="8" w:space="0" w:color="000000"/>
+          <w:bottom w:val="single" w:sz="8" w:space="0" w:color="000000"/>
+          <w:insideH w:val="single" w:sz="2" w:space="0" w:color="999999"/>
+        </w:tblBorders>
         <w:tblLayout w:type="fixed"/>
         <w:tblLook w:firstRow="1" w:lastRow="0" w:firstColumn="0" w:lastColumn="0" w:noHBand="0" w:noVBand="0" w:val="0020"/>
       </w:tblPr>
@@ -8770,6 +9008,10 @@
               <w:pStyle w:val="Compact"/>
             </w:pPr>
             <w:r>
+              <w:rPr>
+                <w:sz w:val="16"/>
+                <w:szCs w:val="16"/>
+              </w:rPr>
               <w:t xml:space="preserve">Profile Index (</w:t>
             </w:r>
             <m:oMath>
@@ -8778,6 +9020,10 @@
               </m:r>
             </m:oMath>
             <w:r>
+              <w:rPr>
+                <w:sz w:val="16"/>
+                <w:szCs w:val="16"/>
+              </w:rPr>
               <w:t xml:space="preserve">)</w:t>
             </w:r>
           </w:p>
@@ -8789,9 +9035,17 @@
               <w:pStyle w:val="Compact"/>
             </w:pPr>
             <w:r>
+              <w:rPr>
+                <w:sz w:val="16"/>
+                <w:szCs w:val="16"/>
+              </w:rPr>
               <w:t xml:space="preserve">Outer Diameter</w:t>
             </w:r>
             <w:r>
+              <w:rPr>
+                <w:sz w:val="16"/>
+                <w:szCs w:val="16"/>
+              </w:rPr>
               <w:t xml:space="preserve"> </w:t>
             </w:r>
             <m:oMath>
@@ -8800,9 +9054,17 @@
               </m:r>
             </m:oMath>
             <w:r>
+              <w:rPr>
+                <w:sz w:val="16"/>
+                <w:szCs w:val="16"/>
+              </w:rPr>
               <w:t xml:space="preserve"> </w:t>
             </w:r>
             <w:r>
+              <w:rPr>
+                <w:sz w:val="16"/>
+                <w:szCs w:val="16"/>
+              </w:rPr>
               <w:t xml:space="preserve">[mm]</w:t>
             </w:r>
           </w:p>
@@ -8814,9 +9076,17 @@
               <w:pStyle w:val="Compact"/>
             </w:pPr>
             <w:r>
+              <w:rPr>
+                <w:sz w:val="16"/>
+                <w:szCs w:val="16"/>
+              </w:rPr>
               <w:t xml:space="preserve">Wall Thickness</w:t>
             </w:r>
             <w:r>
+              <w:rPr>
+                <w:sz w:val="16"/>
+                <w:szCs w:val="16"/>
+              </w:rPr>
               <w:t xml:space="preserve"> </w:t>
             </w:r>
             <m:oMath>
@@ -8825,9 +9095,17 @@
               </m:r>
             </m:oMath>
             <w:r>
+              <w:rPr>
+                <w:sz w:val="16"/>
+                <w:szCs w:val="16"/>
+              </w:rPr>
               <w:t xml:space="preserve"> </w:t>
             </w:r>
             <w:r>
+              <w:rPr>
+                <w:sz w:val="16"/>
+                <w:szCs w:val="16"/>
+              </w:rPr>
               <w:t xml:space="preserve">[mm]</w:t>
             </w:r>
           </w:p>
@@ -8839,9 +9117,17 @@
               <w:pStyle w:val="Compact"/>
             </w:pPr>
             <w:r>
+              <w:rPr>
+                <w:sz w:val="16"/>
+                <w:szCs w:val="16"/>
+              </w:rPr>
               <w:t xml:space="preserve">Inner Diameter</w:t>
             </w:r>
             <w:r>
+              <w:rPr>
+                <w:sz w:val="16"/>
+                <w:szCs w:val="16"/>
+              </w:rPr>
               <w:t xml:space="preserve"> </w:t>
             </w:r>
             <m:oMath>
@@ -8850,9 +9136,17 @@
               </m:r>
             </m:oMath>
             <w:r>
+              <w:rPr>
+                <w:sz w:val="16"/>
+                <w:szCs w:val="16"/>
+              </w:rPr>
               <w:t xml:space="preserve"> </w:t>
             </w:r>
             <w:r>
+              <w:rPr>
+                <w:sz w:val="16"/>
+                <w:szCs w:val="16"/>
+              </w:rPr>
               <w:t xml:space="preserve">[mm]</w:t>
             </w:r>
           </w:p>
@@ -8864,9 +9158,17 @@
               <w:pStyle w:val="Compact"/>
             </w:pPr>
             <w:r>
+              <w:rPr>
+                <w:sz w:val="16"/>
+                <w:szCs w:val="16"/>
+              </w:rPr>
               <w:t xml:space="preserve">Cross-Section Area</w:t>
             </w:r>
             <w:r>
+              <w:rPr>
+                <w:sz w:val="16"/>
+                <w:szCs w:val="16"/>
+              </w:rPr>
               <w:t xml:space="preserve"> </w:t>
             </w:r>
             <m:oMath>
@@ -8875,9 +9177,17 @@
               </m:r>
             </m:oMath>
             <w:r>
+              <w:rPr>
+                <w:sz w:val="16"/>
+                <w:szCs w:val="16"/>
+              </w:rPr>
               <w:t xml:space="preserve"> </w:t>
             </w:r>
             <w:r>
+              <w:rPr>
+                <w:sz w:val="16"/>
+                <w:szCs w:val="16"/>
+              </w:rPr>
               <w:t xml:space="preserve">[mm²]</w:t>
             </w:r>
           </w:p>
@@ -8889,9 +9199,17 @@
               <w:pStyle w:val="Compact"/>
             </w:pPr>
             <w:r>
+              <w:rPr>
+                <w:sz w:val="16"/>
+                <w:szCs w:val="16"/>
+              </w:rPr>
               <w:t xml:space="preserve">Moment of Inertia</w:t>
             </w:r>
             <w:r>
+              <w:rPr>
+                <w:sz w:val="16"/>
+                <w:szCs w:val="16"/>
+              </w:rPr>
               <w:t xml:space="preserve"> </w:t>
             </w:r>
             <m:oMath>
@@ -8900,9 +9218,17 @@
               </m:r>
             </m:oMath>
             <w:r>
+              <w:rPr>
+                <w:sz w:val="16"/>
+                <w:szCs w:val="16"/>
+              </w:rPr>
               <w:t xml:space="preserve"> </w:t>
             </w:r>
             <w:r>
+              <w:rPr>
+                <w:sz w:val="16"/>
+                <w:szCs w:val="16"/>
+              </w:rPr>
               <w:t xml:space="preserve">[</w:t>
             </w:r>
             <m:oMath>
@@ -8920,9 +9246,17 @@
               </m:sSup>
             </m:oMath>
             <w:r>
+              <w:rPr>
+                <w:sz w:val="16"/>
+                <w:szCs w:val="16"/>
+              </w:rPr>
               <w:t xml:space="preserve"> </w:t>
             </w:r>
             <w:r>
+              <w:rPr>
+                <w:sz w:val="16"/>
+                <w:szCs w:val="16"/>
+              </w:rPr>
               <w:t xml:space="preserve">mm⁴]</w:t>
             </w:r>
           </w:p>
@@ -8934,9 +9268,17 @@
               <w:pStyle w:val="Compact"/>
             </w:pPr>
             <w:r>
+              <w:rPr>
+                <w:sz w:val="16"/>
+                <w:szCs w:val="16"/>
+              </w:rPr>
               <w:t xml:space="preserve">Radius of Gyration</w:t>
             </w:r>
             <w:r>
+              <w:rPr>
+                <w:sz w:val="16"/>
+                <w:szCs w:val="16"/>
+              </w:rPr>
               <w:t xml:space="preserve"> </w:t>
             </w:r>
             <m:oMath>
@@ -8945,9 +9287,17 @@
               </m:r>
             </m:oMath>
             <w:r>
+              <w:rPr>
+                <w:sz w:val="16"/>
+                <w:szCs w:val="16"/>
+              </w:rPr>
               <w:t xml:space="preserve"> </w:t>
             </w:r>
             <w:r>
+              <w:rPr>
+                <w:sz w:val="16"/>
+                <w:szCs w:val="16"/>
+              </w:rPr>
               <w:t xml:space="preserve">[mm]</w:t>
             </w:r>
           </w:p>
@@ -8961,6 +9311,10 @@
               <w:pStyle w:val="Compact"/>
             </w:pPr>
             <w:r>
+              <w:rPr>
+                <w:sz w:val="16"/>
+                <w:szCs w:val="16"/>
+              </w:rPr>
               <w:t xml:space="preserve">1</w:t>
             </w:r>
           </w:p>
@@ -8972,6 +9326,10 @@
               <w:pStyle w:val="Compact"/>
             </w:pPr>
             <w:r>
+              <w:rPr>
+                <w:sz w:val="16"/>
+                <w:szCs w:val="16"/>
+              </w:rPr>
               <w:t xml:space="preserve">80</w:t>
             </w:r>
           </w:p>
@@ -8983,6 +9341,10 @@
               <w:pStyle w:val="Compact"/>
             </w:pPr>
             <w:r>
+              <w:rPr>
+                <w:sz w:val="16"/>
+                <w:szCs w:val="16"/>
+              </w:rPr>
               <w:t xml:space="preserve">6</w:t>
             </w:r>
           </w:p>
@@ -8994,6 +9356,10 @@
               <w:pStyle w:val="Compact"/>
             </w:pPr>
             <w:r>
+              <w:rPr>
+                <w:sz w:val="16"/>
+                <w:szCs w:val="16"/>
+              </w:rPr>
               <w:t xml:space="preserve">68</w:t>
             </w:r>
           </w:p>
@@ -9005,6 +9371,10 @@
               <w:pStyle w:val="Compact"/>
             </w:pPr>
             <w:r>
+              <w:rPr>
+                <w:sz w:val="16"/>
+                <w:szCs w:val="16"/>
+              </w:rPr>
               <w:t xml:space="preserve">1394.9</w:t>
             </w:r>
           </w:p>
@@ -9016,6 +9386,10 @@
               <w:pStyle w:val="Compact"/>
             </w:pPr>
             <w:r>
+              <w:rPr>
+                <w:sz w:val="16"/>
+                <w:szCs w:val="16"/>
+              </w:rPr>
               <w:t xml:space="preserve">96.1</w:t>
             </w:r>
           </w:p>
@@ -9027,6 +9401,10 @@
               <w:pStyle w:val="Compact"/>
             </w:pPr>
             <w:r>
+              <w:rPr>
+                <w:sz w:val="16"/>
+                <w:szCs w:val="16"/>
+              </w:rPr>
               <w:t xml:space="preserve">26.25</w:t>
             </w:r>
           </w:p>
@@ -9040,6 +9418,10 @@
               <w:pStyle w:val="Compact"/>
             </w:pPr>
             <w:r>
+              <w:rPr>
+                <w:sz w:val="16"/>
+                <w:szCs w:val="16"/>
+              </w:rPr>
               <w:t xml:space="preserve">2</w:t>
             </w:r>
           </w:p>
@@ -9051,6 +9433,10 @@
               <w:pStyle w:val="Compact"/>
             </w:pPr>
             <w:r>
+              <w:rPr>
+                <w:sz w:val="16"/>
+                <w:szCs w:val="16"/>
+              </w:rPr>
               <w:t xml:space="preserve">80</w:t>
             </w:r>
           </w:p>
@@ -9062,6 +9448,10 @@
               <w:pStyle w:val="Compact"/>
             </w:pPr>
             <w:r>
+              <w:rPr>
+                <w:sz w:val="16"/>
+                <w:szCs w:val="16"/>
+              </w:rPr>
               <w:t xml:space="preserve">9</w:t>
             </w:r>
           </w:p>
@@ -9073,6 +9463,10 @@
               <w:pStyle w:val="Compact"/>
             </w:pPr>
             <w:r>
+              <w:rPr>
+                <w:sz w:val="16"/>
+                <w:szCs w:val="16"/>
+              </w:rPr>
               <w:t xml:space="preserve">62</w:t>
             </w:r>
           </w:p>
@@ -9084,6 +9478,10 @@
               <w:pStyle w:val="Compact"/>
             </w:pPr>
             <w:r>
+              <w:rPr>
+                <w:sz w:val="16"/>
+                <w:szCs w:val="16"/>
+              </w:rPr>
               <w:t xml:space="preserve">2007.5</w:t>
             </w:r>
           </w:p>
@@ -9095,6 +9493,10 @@
               <w:pStyle w:val="Compact"/>
             </w:pPr>
             <w:r>
+              <w:rPr>
+                <w:sz w:val="16"/>
+                <w:szCs w:val="16"/>
+              </w:rPr>
               <w:t xml:space="preserve">128.5</w:t>
             </w:r>
           </w:p>
@@ -9106,6 +9508,10 @@
               <w:pStyle w:val="Compact"/>
             </w:pPr>
             <w:r>
+              <w:rPr>
+                <w:sz w:val="16"/>
+                <w:szCs w:val="16"/>
+              </w:rPr>
               <w:t xml:space="preserve">25.30</w:t>
             </w:r>
           </w:p>
@@ -9119,6 +9525,10 @@
               <w:pStyle w:val="Compact"/>
             </w:pPr>
             <w:r>
+              <w:rPr>
+                <w:sz w:val="16"/>
+                <w:szCs w:val="16"/>
+              </w:rPr>
               <w:t xml:space="preserve">3</w:t>
             </w:r>
           </w:p>
@@ -9130,6 +9540,10 @@
               <w:pStyle w:val="Compact"/>
             </w:pPr>
             <w:r>
+              <w:rPr>
+                <w:sz w:val="16"/>
+                <w:szCs w:val="16"/>
+              </w:rPr>
               <w:t xml:space="preserve">80</w:t>
             </w:r>
           </w:p>
@@ -9141,6 +9555,10 @@
               <w:pStyle w:val="Compact"/>
             </w:pPr>
             <w:r>
+              <w:rPr>
+                <w:sz w:val="16"/>
+                <w:szCs w:val="16"/>
+              </w:rPr>
               <w:t xml:space="preserve">12</w:t>
             </w:r>
           </w:p>
@@ -9152,6 +9570,10 @@
               <w:pStyle w:val="Compact"/>
             </w:pPr>
             <w:r>
+              <w:rPr>
+                <w:sz w:val="16"/>
+                <w:szCs w:val="16"/>
+              </w:rPr>
               <w:t xml:space="preserve">56</w:t>
             </w:r>
           </w:p>
@@ -9163,6 +9585,10 @@
               <w:pStyle w:val="Compact"/>
             </w:pPr>
             <w:r>
+              <w:rPr>
+                <w:sz w:val="16"/>
+                <w:szCs w:val="16"/>
+              </w:rPr>
               <w:t xml:space="preserve">2563.5</w:t>
             </w:r>
           </w:p>
@@ -9174,6 +9600,10 @@
               <w:pStyle w:val="Compact"/>
             </w:pPr>
             <w:r>
+              <w:rPr>
+                <w:sz w:val="16"/>
+                <w:szCs w:val="16"/>
+              </w:rPr>
               <w:t xml:space="preserve">152.8</w:t>
             </w:r>
           </w:p>
@@ -9185,6 +9615,10 @@
               <w:pStyle w:val="Compact"/>
             </w:pPr>
             <w:r>
+              <w:rPr>
+                <w:sz w:val="16"/>
+                <w:szCs w:val="16"/>
+              </w:rPr>
               <w:t xml:space="preserve">24.41</w:t>
             </w:r>
           </w:p>
@@ -9198,6 +9632,10 @@
               <w:pStyle w:val="Compact"/>
             </w:pPr>
             <w:r>
+              <w:rPr>
+                <w:sz w:val="16"/>
+                <w:szCs w:val="16"/>
+              </w:rPr>
               <w:t xml:space="preserve">4</w:t>
             </w:r>
           </w:p>
@@ -9209,6 +9647,10 @@
               <w:pStyle w:val="Compact"/>
             </w:pPr>
             <w:r>
+              <w:rPr>
+                <w:sz w:val="16"/>
+                <w:szCs w:val="16"/>
+              </w:rPr>
               <w:t xml:space="preserve">90</w:t>
             </w:r>
           </w:p>
@@ -9220,6 +9662,10 @@
               <w:pStyle w:val="Compact"/>
             </w:pPr>
             <w:r>
+              <w:rPr>
+                <w:sz w:val="16"/>
+                <w:szCs w:val="16"/>
+              </w:rPr>
               <w:t xml:space="preserve">7</w:t>
             </w:r>
           </w:p>
@@ -9231,6 +9677,10 @@
               <w:pStyle w:val="Compact"/>
             </w:pPr>
             <w:r>
+              <w:rPr>
+                <w:sz w:val="16"/>
+                <w:szCs w:val="16"/>
+              </w:rPr>
               <w:t xml:space="preserve">76</w:t>
             </w:r>
           </w:p>
@@ -9242,6 +9692,10 @@
               <w:pStyle w:val="Compact"/>
             </w:pPr>
             <w:r>
+              <w:rPr>
+                <w:sz w:val="16"/>
+                <w:szCs w:val="16"/>
+              </w:rPr>
               <w:t xml:space="preserve">1825.3</w:t>
             </w:r>
           </w:p>
@@ -9253,6 +9707,10 @@
               <w:pStyle w:val="Compact"/>
             </w:pPr>
             <w:r>
+              <w:rPr>
+                <w:sz w:val="16"/>
+                <w:szCs w:val="16"/>
+              </w:rPr>
               <w:t xml:space="preserve">158.3</w:t>
             </w:r>
           </w:p>
@@ -9264,6 +9722,10 @@
               <w:pStyle w:val="Compact"/>
             </w:pPr>
             <w:r>
+              <w:rPr>
+                <w:sz w:val="16"/>
+                <w:szCs w:val="16"/>
+              </w:rPr>
               <w:t xml:space="preserve">29.45</w:t>
             </w:r>
           </w:p>
@@ -9277,6 +9739,10 @@
               <w:pStyle w:val="Compact"/>
             </w:pPr>
             <w:r>
+              <w:rPr>
+                <w:sz w:val="16"/>
+                <w:szCs w:val="16"/>
+              </w:rPr>
               <w:t xml:space="preserve">5</w:t>
             </w:r>
           </w:p>
@@ -9288,6 +9754,10 @@
               <w:pStyle w:val="Compact"/>
             </w:pPr>
             <w:r>
+              <w:rPr>
+                <w:sz w:val="16"/>
+                <w:szCs w:val="16"/>
+              </w:rPr>
               <w:t xml:space="preserve">90</w:t>
             </w:r>
           </w:p>
@@ -9299,6 +9769,10 @@
               <w:pStyle w:val="Compact"/>
             </w:pPr>
             <w:r>
+              <w:rPr>
+                <w:sz w:val="16"/>
+                <w:szCs w:val="16"/>
+              </w:rPr>
               <w:t xml:space="preserve">10</w:t>
             </w:r>
           </w:p>
@@ -9310,6 +9784,10 @@
               <w:pStyle w:val="Compact"/>
             </w:pPr>
             <w:r>
+              <w:rPr>
+                <w:sz w:val="16"/>
+                <w:szCs w:val="16"/>
+              </w:rPr>
               <w:t xml:space="preserve">70</w:t>
             </w:r>
           </w:p>
@@ -9321,6 +9799,10 @@
               <w:pStyle w:val="Compact"/>
             </w:pPr>
             <w:r>
+              <w:rPr>
+                <w:sz w:val="16"/>
+                <w:szCs w:val="16"/>
+              </w:rPr>
               <w:t xml:space="preserve">2513.3</w:t>
             </w:r>
           </w:p>
@@ -9332,6 +9814,10 @@
               <w:pStyle w:val="Compact"/>
             </w:pPr>
             <w:r>
+              <w:rPr>
+                <w:sz w:val="16"/>
+                <w:szCs w:val="16"/>
+              </w:rPr>
               <w:t xml:space="preserve">204.2</w:t>
             </w:r>
           </w:p>
@@ -9343,6 +9829,10 @@
               <w:pStyle w:val="Compact"/>
             </w:pPr>
             <w:r>
+              <w:rPr>
+                <w:sz w:val="16"/>
+                <w:szCs w:val="16"/>
+              </w:rPr>
               <w:t xml:space="preserve">28.50</w:t>
             </w:r>
           </w:p>
@@ -9356,6 +9846,10 @@
               <w:pStyle w:val="Compact"/>
             </w:pPr>
             <w:r>
+              <w:rPr>
+                <w:sz w:val="16"/>
+                <w:szCs w:val="16"/>
+              </w:rPr>
               <w:t xml:space="preserve">6</w:t>
             </w:r>
           </w:p>
@@ -9367,6 +9861,10 @@
               <w:pStyle w:val="Compact"/>
             </w:pPr>
             <w:r>
+              <w:rPr>
+                <w:sz w:val="16"/>
+                <w:szCs w:val="16"/>
+              </w:rPr>
               <w:t xml:space="preserve">90</w:t>
             </w:r>
           </w:p>
@@ -9378,6 +9876,10 @@
               <w:pStyle w:val="Compact"/>
             </w:pPr>
             <w:r>
+              <w:rPr>
+                <w:sz w:val="16"/>
+                <w:szCs w:val="16"/>
+              </w:rPr>
               <w:t xml:space="preserve">14</w:t>
             </w:r>
           </w:p>
@@ -9389,6 +9891,10 @@
               <w:pStyle w:val="Compact"/>
             </w:pPr>
             <w:r>
+              <w:rPr>
+                <w:sz w:val="16"/>
+                <w:szCs w:val="16"/>
+              </w:rPr>
               <w:t xml:space="preserve">62</w:t>
             </w:r>
           </w:p>
@@ -9400,6 +9906,10 @@
               <w:pStyle w:val="Compact"/>
             </w:pPr>
             <w:r>
+              <w:rPr>
+                <w:sz w:val="16"/>
+                <w:szCs w:val="16"/>
+              </w:rPr>
               <w:t xml:space="preserve">3342.7</w:t>
             </w:r>
           </w:p>
@@ -9411,6 +9921,10 @@
               <w:pStyle w:val="Compact"/>
             </w:pPr>
             <w:r>
+              <w:rPr>
+                <w:sz w:val="16"/>
+                <w:szCs w:val="16"/>
+              </w:rPr>
               <w:t xml:space="preserve">249.5</w:t>
             </w:r>
           </w:p>
@@ -9422,6 +9936,10 @@
               <w:pStyle w:val="Compact"/>
             </w:pPr>
             <w:r>
+              <w:rPr>
+                <w:sz w:val="16"/>
+                <w:szCs w:val="16"/>
+              </w:rPr>
               <w:t xml:space="preserve">27.32</w:t>
             </w:r>
           </w:p>
@@ -9435,6 +9953,10 @@
               <w:pStyle w:val="Compact"/>
             </w:pPr>
             <w:r>
+              <w:rPr>
+                <w:sz w:val="16"/>
+                <w:szCs w:val="16"/>
+              </w:rPr>
               <w:t xml:space="preserve">7</w:t>
             </w:r>
           </w:p>
@@ -9446,6 +9968,10 @@
               <w:pStyle w:val="Compact"/>
             </w:pPr>
             <w:r>
+              <w:rPr>
+                <w:sz w:val="16"/>
+                <w:szCs w:val="16"/>
+              </w:rPr>
               <w:t xml:space="preserve">100</w:t>
             </w:r>
           </w:p>
@@ -9457,6 +9983,10 @@
               <w:pStyle w:val="Compact"/>
             </w:pPr>
             <w:r>
+              <w:rPr>
+                <w:sz w:val="16"/>
+                <w:szCs w:val="16"/>
+              </w:rPr>
               <w:t xml:space="preserve">7</w:t>
             </w:r>
           </w:p>
@@ -9468,6 +9998,10 @@
               <w:pStyle w:val="Compact"/>
             </w:pPr>
             <w:r>
+              <w:rPr>
+                <w:sz w:val="16"/>
+                <w:szCs w:val="16"/>
+              </w:rPr>
               <w:t xml:space="preserve">86</w:t>
             </w:r>
           </w:p>
@@ -9479,6 +10013,10 @@
               <w:pStyle w:val="Compact"/>
             </w:pPr>
             <w:r>
+              <w:rPr>
+                <w:sz w:val="16"/>
+                <w:szCs w:val="16"/>
+              </w:rPr>
               <w:t xml:space="preserve">2045.2</w:t>
             </w:r>
           </w:p>
@@ -9490,6 +10028,10 @@
               <w:pStyle w:val="Compact"/>
             </w:pPr>
             <w:r>
+              <w:rPr>
+                <w:sz w:val="16"/>
+                <w:szCs w:val="16"/>
+              </w:rPr>
               <w:t xml:space="preserve">222.4</w:t>
             </w:r>
           </w:p>
@@ -9501,6 +10043,10 @@
               <w:pStyle w:val="Compact"/>
             </w:pPr>
             <w:r>
+              <w:rPr>
+                <w:sz w:val="16"/>
+                <w:szCs w:val="16"/>
+              </w:rPr>
               <w:t xml:space="preserve">32.97</w:t>
             </w:r>
           </w:p>
@@ -9514,6 +10060,10 @@
               <w:pStyle w:val="Compact"/>
             </w:pPr>
             <w:r>
+              <w:rPr>
+                <w:sz w:val="16"/>
+                <w:szCs w:val="16"/>
+              </w:rPr>
               <w:t xml:space="preserve">8</w:t>
             </w:r>
           </w:p>
@@ -9525,6 +10075,10 @@
               <w:pStyle w:val="Compact"/>
             </w:pPr>
             <w:r>
+              <w:rPr>
+                <w:sz w:val="16"/>
+                <w:szCs w:val="16"/>
+              </w:rPr>
               <w:t xml:space="preserve">100</w:t>
             </w:r>
           </w:p>
@@ -9536,6 +10090,10 @@
               <w:pStyle w:val="Compact"/>
             </w:pPr>
             <w:r>
+              <w:rPr>
+                <w:sz w:val="16"/>
+                <w:szCs w:val="16"/>
+              </w:rPr>
               <w:t xml:space="preserve">10</w:t>
             </w:r>
           </w:p>
@@ -9547,6 +10105,10 @@
               <w:pStyle w:val="Compact"/>
             </w:pPr>
             <w:r>
+              <w:rPr>
+                <w:sz w:val="16"/>
+                <w:szCs w:val="16"/>
+              </w:rPr>
               <w:t xml:space="preserve">80</w:t>
             </w:r>
           </w:p>
@@ -9558,6 +10120,10 @@
               <w:pStyle w:val="Compact"/>
             </w:pPr>
             <w:r>
+              <w:rPr>
+                <w:sz w:val="16"/>
+                <w:szCs w:val="16"/>
+              </w:rPr>
               <w:t xml:space="preserve">2827.4</w:t>
             </w:r>
           </w:p>
@@ -9569,6 +10135,10 @@
               <w:pStyle w:val="Compact"/>
             </w:pPr>
             <w:r>
+              <w:rPr>
+                <w:sz w:val="16"/>
+                <w:szCs w:val="16"/>
+              </w:rPr>
               <w:t xml:space="preserve">289.8</w:t>
             </w:r>
           </w:p>
@@ -9580,6 +10150,10 @@
               <w:pStyle w:val="Compact"/>
             </w:pPr>
             <w:r>
+              <w:rPr>
+                <w:sz w:val="16"/>
+                <w:szCs w:val="16"/>
+              </w:rPr>
               <w:t xml:space="preserve">32.02</w:t>
             </w:r>
           </w:p>
@@ -9593,6 +10167,10 @@
               <w:pStyle w:val="Compact"/>
             </w:pPr>
             <w:r>
+              <w:rPr>
+                <w:sz w:val="16"/>
+                <w:szCs w:val="16"/>
+              </w:rPr>
               <w:t xml:space="preserve">9</w:t>
             </w:r>
           </w:p>
@@ -9604,6 +10182,10 @@
               <w:pStyle w:val="Compact"/>
             </w:pPr>
             <w:r>
+              <w:rPr>
+                <w:sz w:val="16"/>
+                <w:szCs w:val="16"/>
+              </w:rPr>
               <w:t xml:space="preserve">100</w:t>
             </w:r>
           </w:p>
@@ -9615,6 +10197,10 @@
               <w:pStyle w:val="Compact"/>
             </w:pPr>
             <w:r>
+              <w:rPr>
+                <w:sz w:val="16"/>
+                <w:szCs w:val="16"/>
+              </w:rPr>
               <w:t xml:space="preserve">14</w:t>
             </w:r>
           </w:p>
@@ -9626,6 +10212,10 @@
               <w:pStyle w:val="Compact"/>
             </w:pPr>
             <w:r>
+              <w:rPr>
+                <w:sz w:val="16"/>
+                <w:szCs w:val="16"/>
+              </w:rPr>
               <w:t xml:space="preserve">72</w:t>
             </w:r>
           </w:p>
@@ -9637,6 +10227,10 @@
               <w:pStyle w:val="Compact"/>
             </w:pPr>
             <w:r>
+              <w:rPr>
+                <w:sz w:val="16"/>
+                <w:szCs w:val="16"/>
+              </w:rPr>
               <w:t xml:space="preserve">3782.5</w:t>
             </w:r>
           </w:p>
@@ -9648,6 +10242,10 @@
               <w:pStyle w:val="Compact"/>
             </w:pPr>
             <w:r>
+              <w:rPr>
+                <w:sz w:val="16"/>
+                <w:szCs w:val="16"/>
+              </w:rPr>
               <w:t xml:space="preserve">359.0</w:t>
             </w:r>
           </w:p>
@@ -9659,6 +10257,10 @@
               <w:pStyle w:val="Compact"/>
             </w:pPr>
             <w:r>
+              <w:rPr>
+                <w:sz w:val="16"/>
+                <w:szCs w:val="16"/>
+              </w:rPr>
               <w:t xml:space="preserve">30.81</w:t>
             </w:r>
           </w:p>
@@ -9672,6 +10274,10 @@
               <w:pStyle w:val="Compact"/>
             </w:pPr>
             <w:r>
+              <w:rPr>
+                <w:sz w:val="16"/>
+                <w:szCs w:val="16"/>
+              </w:rPr>
               <w:t xml:space="preserve">10</w:t>
             </w:r>
           </w:p>
@@ -9683,6 +10289,10 @@
               <w:pStyle w:val="Compact"/>
             </w:pPr>
             <w:r>
+              <w:rPr>
+                <w:sz w:val="16"/>
+                <w:szCs w:val="16"/>
+              </w:rPr>
               <w:t xml:space="preserve">110</w:t>
             </w:r>
           </w:p>
@@ -9694,6 +10304,10 @@
               <w:pStyle w:val="Compact"/>
             </w:pPr>
             <w:r>
+              <w:rPr>
+                <w:sz w:val="16"/>
+                <w:szCs w:val="16"/>
+              </w:rPr>
               <w:t xml:space="preserve">8</w:t>
             </w:r>
           </w:p>
@@ -9705,6 +10319,10 @@
               <w:pStyle w:val="Compact"/>
             </w:pPr>
             <w:r>
+              <w:rPr>
+                <w:sz w:val="16"/>
+                <w:szCs w:val="16"/>
+              </w:rPr>
               <w:t xml:space="preserve">94</w:t>
             </w:r>
           </w:p>
@@ -9716,6 +10334,10 @@
               <w:pStyle w:val="Compact"/>
             </w:pPr>
             <w:r>
+              <w:rPr>
+                <w:sz w:val="16"/>
+                <w:szCs w:val="16"/>
+              </w:rPr>
               <w:t xml:space="preserve">2563.5</w:t>
             </w:r>
           </w:p>
@@ -9727,6 +10349,10 @@
               <w:pStyle w:val="Compact"/>
             </w:pPr>
             <w:r>
+              <w:rPr>
+                <w:sz w:val="16"/>
+                <w:szCs w:val="16"/>
+              </w:rPr>
               <w:t xml:space="preserve">335.4</w:t>
             </w:r>
           </w:p>
@@ -9738,6 +10364,10 @@
               <w:pStyle w:val="Compact"/>
             </w:pPr>
             <w:r>
+              <w:rPr>
+                <w:sz w:val="16"/>
+                <w:szCs w:val="16"/>
+              </w:rPr>
               <w:t xml:space="preserve">36.17</w:t>
             </w:r>
           </w:p>
@@ -9751,6 +10381,10 @@
               <w:pStyle w:val="Compact"/>
             </w:pPr>
             <w:r>
+              <w:rPr>
+                <w:sz w:val="16"/>
+                <w:szCs w:val="16"/>
+              </w:rPr>
               <w:t xml:space="preserve">11</w:t>
             </w:r>
           </w:p>
@@ -9762,6 +10396,10 @@
               <w:pStyle w:val="Compact"/>
             </w:pPr>
             <w:r>
+              <w:rPr>
+                <w:sz w:val="16"/>
+                <w:szCs w:val="16"/>
+              </w:rPr>
               <w:t xml:space="preserve">110</w:t>
             </w:r>
           </w:p>
@@ -9773,6 +10411,10 @@
               <w:pStyle w:val="Compact"/>
             </w:pPr>
             <w:r>
+              <w:rPr>
+                <w:sz w:val="16"/>
+                <w:szCs w:val="16"/>
+              </w:rPr>
               <w:t xml:space="preserve">11</w:t>
             </w:r>
           </w:p>
@@ -9784,6 +10426,10 @@
               <w:pStyle w:val="Compact"/>
             </w:pPr>
             <w:r>
+              <w:rPr>
+                <w:sz w:val="16"/>
+                <w:szCs w:val="16"/>
+              </w:rPr>
               <w:t xml:space="preserve">88</w:t>
             </w:r>
           </w:p>
@@ -9795,6 +10441,10 @@
               <w:pStyle w:val="Compact"/>
             </w:pPr>
             <w:r>
+              <w:rPr>
+                <w:sz w:val="16"/>
+                <w:szCs w:val="16"/>
+              </w:rPr>
               <w:t xml:space="preserve">3421.2</w:t>
             </w:r>
           </w:p>
@@ -9806,6 +10456,10 @@
               <w:pStyle w:val="Compact"/>
             </w:pPr>
             <w:r>
+              <w:rPr>
+                <w:sz w:val="16"/>
+                <w:szCs w:val="16"/>
+              </w:rPr>
               <w:t xml:space="preserve">424.3</w:t>
             </w:r>
           </w:p>
@@ -9817,6 +10471,10 @@
               <w:pStyle w:val="Compact"/>
             </w:pPr>
             <w:r>
+              <w:rPr>
+                <w:sz w:val="16"/>
+                <w:szCs w:val="16"/>
+              </w:rPr>
               <w:t xml:space="preserve">35.22</w:t>
             </w:r>
           </w:p>
@@ -9830,6 +10488,10 @@
               <w:pStyle w:val="Compact"/>
             </w:pPr>
             <w:r>
+              <w:rPr>
+                <w:sz w:val="16"/>
+                <w:szCs w:val="16"/>
+              </w:rPr>
               <w:t xml:space="preserve">12</w:t>
             </w:r>
           </w:p>
@@ -9841,6 +10503,10 @@
               <w:pStyle w:val="Compact"/>
             </w:pPr>
             <w:r>
+              <w:rPr>
+                <w:sz w:val="16"/>
+                <w:szCs w:val="16"/>
+              </w:rPr>
               <w:t xml:space="preserve">110</w:t>
             </w:r>
           </w:p>
@@ -9852,6 +10518,10 @@
               <w:pStyle w:val="Compact"/>
             </w:pPr>
             <w:r>
+              <w:rPr>
+                <w:sz w:val="16"/>
+                <w:szCs w:val="16"/>
+              </w:rPr>
               <w:t xml:space="preserve">15</w:t>
             </w:r>
           </w:p>
@@ -9863,6 +10533,10 @@
               <w:pStyle w:val="Compact"/>
             </w:pPr>
             <w:r>
+              <w:rPr>
+                <w:sz w:val="16"/>
+                <w:szCs w:val="16"/>
+              </w:rPr>
               <w:t xml:space="preserve">80</w:t>
             </w:r>
           </w:p>
@@ -9874,6 +10548,10 @@
               <w:pStyle w:val="Compact"/>
             </w:pPr>
             <w:r>
+              <w:rPr>
+                <w:sz w:val="16"/>
+                <w:szCs w:val="16"/>
+              </w:rPr>
               <w:t xml:space="preserve">4476.8</w:t>
             </w:r>
           </w:p>
@@ -9885,6 +10563,10 @@
               <w:pStyle w:val="Compact"/>
             </w:pPr>
             <w:r>
+              <w:rPr>
+                <w:sz w:val="16"/>
+                <w:szCs w:val="16"/>
+              </w:rPr>
               <w:t xml:space="preserve">517.6</w:t>
             </w:r>
           </w:p>
@@ -9896,6 +10578,10 @@
               <w:pStyle w:val="Compact"/>
             </w:pPr>
             <w:r>
+              <w:rPr>
+                <w:sz w:val="16"/>
+                <w:szCs w:val="16"/>
+              </w:rPr>
               <w:t xml:space="preserve">34.00</w:t>
             </w:r>
           </w:p>
@@ -9909,6 +10595,10 @@
               <w:pStyle w:val="Compact"/>
             </w:pPr>
             <w:r>
+              <w:rPr>
+                <w:sz w:val="16"/>
+                <w:szCs w:val="16"/>
+              </w:rPr>
               <w:t xml:space="preserve">13</w:t>
             </w:r>
           </w:p>
@@ -9920,6 +10610,10 @@
               <w:pStyle w:val="Compact"/>
             </w:pPr>
             <w:r>
+              <w:rPr>
+                <w:sz w:val="16"/>
+                <w:szCs w:val="16"/>
+              </w:rPr>
               <w:t xml:space="preserve">120</w:t>
             </w:r>
           </w:p>
@@ -9931,6 +10625,10 @@
               <w:pStyle w:val="Compact"/>
             </w:pPr>
             <w:r>
+              <w:rPr>
+                <w:sz w:val="16"/>
+                <w:szCs w:val="16"/>
+              </w:rPr>
               <w:t xml:space="preserve">8</w:t>
             </w:r>
           </w:p>
@@ -9942,6 +10640,10 @@
               <w:pStyle w:val="Compact"/>
             </w:pPr>
             <w:r>
+              <w:rPr>
+                <w:sz w:val="16"/>
+                <w:szCs w:val="16"/>
+              </w:rPr>
               <w:t xml:space="preserve">104</w:t>
             </w:r>
           </w:p>
@@ -9953,6 +10655,10 @@
               <w:pStyle w:val="Compact"/>
             </w:pPr>
             <w:r>
+              <w:rPr>
+                <w:sz w:val="16"/>
+                <w:szCs w:val="16"/>
+              </w:rPr>
               <w:t xml:space="preserve">2814.9</w:t>
             </w:r>
           </w:p>
@@ -9964,6 +10670,10 @@
               <w:pStyle w:val="Compact"/>
             </w:pPr>
             <w:r>
+              <w:rPr>
+                <w:sz w:val="16"/>
+                <w:szCs w:val="16"/>
+              </w:rPr>
               <w:t xml:space="preserve">443.6</w:t>
             </w:r>
           </w:p>
@@ -9975,6 +10685,10 @@
               <w:pStyle w:val="Compact"/>
             </w:pPr>
             <w:r>
+              <w:rPr>
+                <w:sz w:val="16"/>
+                <w:szCs w:val="16"/>
+              </w:rPr>
               <w:t xml:space="preserve">39.70</w:t>
             </w:r>
           </w:p>
@@ -9988,6 +10702,10 @@
               <w:pStyle w:val="Compact"/>
             </w:pPr>
             <w:r>
+              <w:rPr>
+                <w:sz w:val="16"/>
+                <w:szCs w:val="16"/>
+              </w:rPr>
               <w:t xml:space="preserve">14</w:t>
             </w:r>
           </w:p>
@@ -9999,6 +10717,10 @@
               <w:pStyle w:val="Compact"/>
             </w:pPr>
             <w:r>
+              <w:rPr>
+                <w:sz w:val="16"/>
+                <w:szCs w:val="16"/>
+              </w:rPr>
               <w:t xml:space="preserve">120</w:t>
             </w:r>
           </w:p>
@@ -10010,6 +10732,10 @@
               <w:pStyle w:val="Compact"/>
             </w:pPr>
             <w:r>
+              <w:rPr>
+                <w:sz w:val="16"/>
+                <w:szCs w:val="16"/>
+              </w:rPr>
               <w:t xml:space="preserve">12</w:t>
             </w:r>
           </w:p>
@@ -10021,6 +10747,10 @@
               <w:pStyle w:val="Compact"/>
             </w:pPr>
             <w:r>
+              <w:rPr>
+                <w:sz w:val="16"/>
+                <w:szCs w:val="16"/>
+              </w:rPr>
               <w:t xml:space="preserve">96</w:t>
             </w:r>
           </w:p>
@@ -10032,6 +10762,10 @@
               <w:pStyle w:val="Compact"/>
             </w:pPr>
             <w:r>
+              <w:rPr>
+                <w:sz w:val="16"/>
+                <w:szCs w:val="16"/>
+              </w:rPr>
               <w:t xml:space="preserve">4071.5</w:t>
             </w:r>
           </w:p>
@@ -10043,6 +10777,10 @@
               <w:pStyle w:val="Compact"/>
             </w:pPr>
             <w:r>
+              <w:rPr>
+                <w:sz w:val="16"/>
+                <w:szCs w:val="16"/>
+              </w:rPr>
               <w:t xml:space="preserve">601.0</w:t>
             </w:r>
           </w:p>
@@ -10054,6 +10792,10 @@
               <w:pStyle w:val="Compact"/>
             </w:pPr>
             <w:r>
+              <w:rPr>
+                <w:sz w:val="16"/>
+                <w:szCs w:val="16"/>
+              </w:rPr>
               <w:t xml:space="preserve">38.42</w:t>
             </w:r>
           </w:p>
@@ -10067,6 +10809,10 @@
               <w:pStyle w:val="Compact"/>
             </w:pPr>
             <w:r>
+              <w:rPr>
+                <w:sz w:val="16"/>
+                <w:szCs w:val="16"/>
+              </w:rPr>
               <w:t xml:space="preserve">15</w:t>
             </w:r>
           </w:p>
@@ -10078,6 +10824,10 @@
               <w:pStyle w:val="Compact"/>
             </w:pPr>
             <w:r>
+              <w:rPr>
+                <w:sz w:val="16"/>
+                <w:szCs w:val="16"/>
+              </w:rPr>
               <w:t xml:space="preserve">120</w:t>
             </w:r>
           </w:p>
@@ -10089,6 +10839,10 @@
               <w:pStyle w:val="Compact"/>
             </w:pPr>
             <w:r>
+              <w:rPr>
+                <w:sz w:val="16"/>
+                <w:szCs w:val="16"/>
+              </w:rPr>
               <w:t xml:space="preserve">16</w:t>
             </w:r>
           </w:p>
@@ -10100,6 +10854,10 @@
               <w:pStyle w:val="Compact"/>
             </w:pPr>
             <w:r>
+              <w:rPr>
+                <w:sz w:val="16"/>
+                <w:szCs w:val="16"/>
+              </w:rPr>
               <w:t xml:space="preserve">88</w:t>
             </w:r>
           </w:p>
@@ -10111,6 +10869,10 @@
               <w:pStyle w:val="Compact"/>
             </w:pPr>
             <w:r>
+              <w:rPr>
+                <w:sz w:val="16"/>
+                <w:szCs w:val="16"/>
+              </w:rPr>
               <w:t xml:space="preserve">5227.6</w:t>
             </w:r>
           </w:p>
@@ -10122,6 +10884,10 @@
               <w:pStyle w:val="Compact"/>
             </w:pPr>
             <w:r>
+              <w:rPr>
+                <w:sz w:val="16"/>
+                <w:szCs w:val="16"/>
+              </w:rPr>
               <w:t xml:space="preserve">723.5</w:t>
             </w:r>
           </w:p>
@@ -10133,6 +10899,10 @@
               <w:pStyle w:val="Compact"/>
             </w:pPr>
             <w:r>
+              <w:rPr>
+                <w:sz w:val="16"/>
+                <w:szCs w:val="16"/>
+              </w:rPr>
               <w:t xml:space="preserve">37.20</w:t>
             </w:r>
           </w:p>
@@ -10146,6 +10916,10 @@
               <w:pStyle w:val="Compact"/>
             </w:pPr>
             <w:r>
+              <w:rPr>
+                <w:sz w:val="16"/>
+                <w:szCs w:val="16"/>
+              </w:rPr>
               <w:t xml:space="preserve">16</w:t>
             </w:r>
           </w:p>
@@ -10157,6 +10931,10 @@
               <w:pStyle w:val="Compact"/>
             </w:pPr>
             <w:r>
+              <w:rPr>
+                <w:sz w:val="16"/>
+                <w:szCs w:val="16"/>
+              </w:rPr>
               <w:t xml:space="preserve">130</w:t>
             </w:r>
           </w:p>
@@ -10168,6 +10946,10 @@
               <w:pStyle w:val="Compact"/>
             </w:pPr>
             <w:r>
+              <w:rPr>
+                <w:sz w:val="16"/>
+                <w:szCs w:val="16"/>
+              </w:rPr>
               <w:t xml:space="preserve">9</w:t>
             </w:r>
           </w:p>
@@ -10179,6 +10961,10 @@
               <w:pStyle w:val="Compact"/>
             </w:pPr>
             <w:r>
+              <w:rPr>
+                <w:sz w:val="16"/>
+                <w:szCs w:val="16"/>
+              </w:rPr>
               <w:t xml:space="preserve">112</w:t>
             </w:r>
           </w:p>
@@ -10190,6 +10976,10 @@
               <w:pStyle w:val="Compact"/>
             </w:pPr>
             <w:r>
+              <w:rPr>
+                <w:sz w:val="16"/>
+                <w:szCs w:val="16"/>
+              </w:rPr>
               <w:t xml:space="preserve">3421.2</w:t>
             </w:r>
           </w:p>
@@ -10201,6 +10991,10 @@
               <w:pStyle w:val="Compact"/>
             </w:pPr>
             <w:r>
+              <w:rPr>
+                <w:sz w:val="16"/>
+                <w:szCs w:val="16"/>
+              </w:rPr>
               <w:t xml:space="preserve">629.6</w:t>
             </w:r>
           </w:p>
@@ -10212,6 +11006,10 @@
               <w:pStyle w:val="Compact"/>
             </w:pPr>
             <w:r>
+              <w:rPr>
+                <w:sz w:val="16"/>
+                <w:szCs w:val="16"/>
+              </w:rPr>
               <w:t xml:space="preserve">42.90</w:t>
             </w:r>
           </w:p>
@@ -10225,6 +11023,10 @@
               <w:pStyle w:val="Compact"/>
             </w:pPr>
             <w:r>
+              <w:rPr>
+                <w:sz w:val="16"/>
+                <w:szCs w:val="16"/>
+              </w:rPr>
               <w:t xml:space="preserve">17</w:t>
             </w:r>
           </w:p>
@@ -10236,6 +11038,10 @@
               <w:pStyle w:val="Compact"/>
             </w:pPr>
             <w:r>
+              <w:rPr>
+                <w:sz w:val="16"/>
+                <w:szCs w:val="16"/>
+              </w:rPr>
               <w:t xml:space="preserve">130</w:t>
             </w:r>
           </w:p>
@@ -10247,6 +11053,10 @@
               <w:pStyle w:val="Compact"/>
             </w:pPr>
             <w:r>
+              <w:rPr>
+                <w:sz w:val="16"/>
+                <w:szCs w:val="16"/>
+              </w:rPr>
               <w:t xml:space="preserve">13</w:t>
             </w:r>
           </w:p>
@@ -10258,6 +11068,10 @@
               <w:pStyle w:val="Compact"/>
             </w:pPr>
             <w:r>
+              <w:rPr>
+                <w:sz w:val="16"/>
+                <w:szCs w:val="16"/>
+              </w:rPr>
               <w:t xml:space="preserve">104</w:t>
             </w:r>
           </w:p>
@@ -10269,6 +11083,10 @@
               <w:pStyle w:val="Compact"/>
             </w:pPr>
             <w:r>
+              <w:rPr>
+                <w:sz w:val="16"/>
+                <w:szCs w:val="16"/>
+              </w:rPr>
               <w:t xml:space="preserve">4778.4</w:t>
             </w:r>
           </w:p>
@@ -10280,6 +11098,10 @@
               <w:pStyle w:val="Compact"/>
             </w:pPr>
             <w:r>
+              <w:rPr>
+                <w:sz w:val="16"/>
+                <w:szCs w:val="16"/>
+              </w:rPr>
               <w:t xml:space="preserve">827.7</w:t>
             </w:r>
           </w:p>
@@ -10291,6 +11113,10 @@
               <w:pStyle w:val="Compact"/>
             </w:pPr>
             <w:r>
+              <w:rPr>
+                <w:sz w:val="16"/>
+                <w:szCs w:val="16"/>
+              </w:rPr>
               <w:t xml:space="preserve">41.62</w:t>
             </w:r>
           </w:p>
@@ -10304,6 +11130,10 @@
               <w:pStyle w:val="Compact"/>
             </w:pPr>
             <w:r>
+              <w:rPr>
+                <w:sz w:val="16"/>
+                <w:szCs w:val="16"/>
+              </w:rPr>
               <w:t xml:space="preserve">18</w:t>
             </w:r>
           </w:p>
@@ -10315,6 +11145,10 @@
               <w:pStyle w:val="Compact"/>
             </w:pPr>
             <w:r>
+              <w:rPr>
+                <w:sz w:val="16"/>
+                <w:szCs w:val="16"/>
+              </w:rPr>
               <w:t xml:space="preserve">130</w:t>
             </w:r>
           </w:p>
@@ -10326,6 +11160,10 @@
               <w:pStyle w:val="Compact"/>
             </w:pPr>
             <w:r>
+              <w:rPr>
+                <w:sz w:val="16"/>
+                <w:szCs w:val="16"/>
+              </w:rPr>
               <w:t xml:space="preserve">18</w:t>
             </w:r>
           </w:p>
@@ -10337,6 +11175,10 @@
               <w:pStyle w:val="Compact"/>
             </w:pPr>
             <w:r>
+              <w:rPr>
+                <w:sz w:val="16"/>
+                <w:szCs w:val="16"/>
+              </w:rPr>
               <w:t xml:space="preserve">94</w:t>
             </w:r>
           </w:p>
@@ -10348,6 +11190,10 @@
               <w:pStyle w:val="Compact"/>
             </w:pPr>
             <w:r>
+              <w:rPr>
+                <w:sz w:val="16"/>
+                <w:szCs w:val="16"/>
+              </w:rPr>
               <w:t xml:space="preserve">6333.5</w:t>
             </w:r>
           </w:p>
@@ -10359,6 +11205,10 @@
               <w:pStyle w:val="Compact"/>
             </w:pPr>
             <w:r>
+              <w:rPr>
+                <w:sz w:val="16"/>
+                <w:szCs w:val="16"/>
+              </w:rPr>
               <w:t xml:space="preserve">1018.7</w:t>
             </w:r>
           </w:p>
@@ -10370,6 +11220,10 @@
               <w:pStyle w:val="Compact"/>
             </w:pPr>
             <w:r>
+              <w:rPr>
+                <w:sz w:val="16"/>
+                <w:szCs w:val="16"/>
+              </w:rPr>
               <w:t xml:space="preserve">40.11</w:t>
             </w:r>
           </w:p>
@@ -10383,6 +11237,10 @@
               <w:pStyle w:val="Compact"/>
             </w:pPr>
             <w:r>
+              <w:rPr>
+                <w:sz w:val="16"/>
+                <w:szCs w:val="16"/>
+              </w:rPr>
               <w:t xml:space="preserve">19</w:t>
             </w:r>
           </w:p>
@@ -10394,6 +11252,10 @@
               <w:pStyle w:val="Compact"/>
             </w:pPr>
             <w:r>
+              <w:rPr>
+                <w:sz w:val="16"/>
+                <w:szCs w:val="16"/>
+              </w:rPr>
               <w:t xml:space="preserve">140</w:t>
             </w:r>
           </w:p>
@@ -10405,6 +11267,10 @@
               <w:pStyle w:val="Compact"/>
             </w:pPr>
             <w:r>
+              <w:rPr>
+                <w:sz w:val="16"/>
+                <w:szCs w:val="16"/>
+              </w:rPr>
               <w:t xml:space="preserve">10</w:t>
             </w:r>
           </w:p>
@@ -10416,6 +11282,10 @@
               <w:pStyle w:val="Compact"/>
             </w:pPr>
             <w:r>
+              <w:rPr>
+                <w:sz w:val="16"/>
+                <w:szCs w:val="16"/>
+              </w:rPr>
               <w:t xml:space="preserve">120</w:t>
             </w:r>
           </w:p>
@@ -10427,6 +11297,10 @@
               <w:pStyle w:val="Compact"/>
             </w:pPr>
             <w:r>
+              <w:rPr>
+                <w:sz w:val="16"/>
+                <w:szCs w:val="16"/>
+              </w:rPr>
               <w:t xml:space="preserve">4084.1</w:t>
             </w:r>
           </w:p>
@@ -10438,6 +11312,10 @@
               <w:pStyle w:val="Compact"/>
             </w:pPr>
             <w:r>
+              <w:rPr>
+                <w:sz w:val="16"/>
+                <w:szCs w:val="16"/>
+              </w:rPr>
               <w:t xml:space="preserve">867.9</w:t>
             </w:r>
           </w:p>
@@ -10449,6 +11327,10 @@
               <w:pStyle w:val="Compact"/>
             </w:pPr>
             <w:r>
+              <w:rPr>
+                <w:sz w:val="16"/>
+                <w:szCs w:val="16"/>
+              </w:rPr>
               <w:t xml:space="preserve">46.10</w:t>
             </w:r>
           </w:p>
@@ -10462,6 +11344,10 @@
               <w:pStyle w:val="Compact"/>
             </w:pPr>
             <w:r>
+              <w:rPr>
+                <w:sz w:val="16"/>
+                <w:szCs w:val="16"/>
+              </w:rPr>
               <w:t xml:space="preserve">20</w:t>
             </w:r>
           </w:p>
@@ -10473,6 +11359,10 @@
               <w:pStyle w:val="Compact"/>
             </w:pPr>
             <w:r>
+              <w:rPr>
+                <w:sz w:val="16"/>
+                <w:szCs w:val="16"/>
+              </w:rPr>
               <w:t xml:space="preserve">140</w:t>
             </w:r>
           </w:p>
@@ -10484,6 +11374,10 @@
               <w:pStyle w:val="Compact"/>
             </w:pPr>
             <w:r>
+              <w:rPr>
+                <w:sz w:val="16"/>
+                <w:szCs w:val="16"/>
+              </w:rPr>
               <w:t xml:space="preserve">15</w:t>
             </w:r>
           </w:p>
@@ -10495,6 +11389,10 @@
               <w:pStyle w:val="Compact"/>
             </w:pPr>
             <w:r>
+              <w:rPr>
+                <w:sz w:val="16"/>
+                <w:szCs w:val="16"/>
+              </w:rPr>
               <w:t xml:space="preserve">110</w:t>
             </w:r>
           </w:p>
@@ -10506,6 +11404,10 @@
               <w:pStyle w:val="Compact"/>
             </w:pPr>
             <w:r>
+              <w:rPr>
+                <w:sz w:val="16"/>
+                <w:szCs w:val="16"/>
+              </w:rPr>
               <w:t xml:space="preserve">5890.5</w:t>
             </w:r>
           </w:p>
@@ -10517,6 +11419,10 @@
               <w:pStyle w:val="Compact"/>
             </w:pPr>
             <w:r>
+              <w:rPr>
+                <w:sz w:val="16"/>
+                <w:szCs w:val="16"/>
+              </w:rPr>
               <w:t xml:space="preserve">1167.1</w:t>
             </w:r>
           </w:p>
@@ -10528,6 +11434,10 @@
               <w:pStyle w:val="Compact"/>
             </w:pPr>
             <w:r>
+              <w:rPr>
+                <w:sz w:val="16"/>
+                <w:szCs w:val="16"/>
+              </w:rPr>
               <w:t xml:space="preserve">44.51</w:t>
             </w:r>
           </w:p>
@@ -10541,6 +11451,10 @@
               <w:pStyle w:val="Compact"/>
             </w:pPr>
             <w:r>
+              <w:rPr>
+                <w:sz w:val="16"/>
+                <w:szCs w:val="16"/>
+              </w:rPr>
               <w:t xml:space="preserve">21</w:t>
             </w:r>
           </w:p>
@@ -10552,6 +11466,10 @@
               <w:pStyle w:val="Compact"/>
             </w:pPr>
             <w:r>
+              <w:rPr>
+                <w:sz w:val="16"/>
+                <w:szCs w:val="16"/>
+              </w:rPr>
               <w:t xml:space="preserve">140</w:t>
             </w:r>
           </w:p>
@@ -10563,6 +11481,10 @@
               <w:pStyle w:val="Compact"/>
             </w:pPr>
             <w:r>
+              <w:rPr>
+                <w:sz w:val="16"/>
+                <w:szCs w:val="16"/>
+              </w:rPr>
               <w:t xml:space="preserve">20</w:t>
             </w:r>
           </w:p>
@@ -10574,6 +11496,10 @@
               <w:pStyle w:val="Compact"/>
             </w:pPr>
             <w:r>
+              <w:rPr>
+                <w:sz w:val="16"/>
+                <w:szCs w:val="16"/>
+              </w:rPr>
               <w:t xml:space="preserve">100</w:t>
             </w:r>
           </w:p>
@@ -10585,6 +11511,10 @@
               <w:pStyle w:val="Compact"/>
             </w:pPr>
             <w:r>
+              <w:rPr>
+                <w:sz w:val="16"/>
+                <w:szCs w:val="16"/>
+              </w:rPr>
               <w:t xml:space="preserve">7539.8</w:t>
             </w:r>
           </w:p>
@@ -10596,6 +11526,10 @@
               <w:pStyle w:val="Compact"/>
             </w:pPr>
             <w:r>
+              <w:rPr>
+                <w:sz w:val="16"/>
+                <w:szCs w:val="16"/>
+              </w:rPr>
               <w:t xml:space="preserve">1394.9</w:t>
             </w:r>
           </w:p>
@@ -10607,6 +11541,10 @@
               <w:pStyle w:val="Compact"/>
             </w:pPr>
             <w:r>
+              <w:rPr>
+                <w:sz w:val="16"/>
+                <w:szCs w:val="16"/>
+              </w:rPr>
               <w:t xml:space="preserve">43.01</w:t>
             </w:r>
           </w:p>
@@ -10620,6 +11558,10 @@
               <w:pStyle w:val="Compact"/>
             </w:pPr>
             <w:r>
+              <w:rPr>
+                <w:sz w:val="16"/>
+                <w:szCs w:val="16"/>
+              </w:rPr>
               <w:t xml:space="preserve">22</w:t>
             </w:r>
           </w:p>
@@ -10631,6 +11573,10 @@
               <w:pStyle w:val="Compact"/>
             </w:pPr>
             <w:r>
+              <w:rPr>
+                <w:sz w:val="16"/>
+                <w:szCs w:val="16"/>
+              </w:rPr>
               <w:t xml:space="preserve">160</w:t>
             </w:r>
           </w:p>
@@ -10642,6 +11588,10 @@
               <w:pStyle w:val="Compact"/>
             </w:pPr>
             <w:r>
+              <w:rPr>
+                <w:sz w:val="16"/>
+                <w:szCs w:val="16"/>
+              </w:rPr>
               <w:t xml:space="preserve">10</w:t>
             </w:r>
           </w:p>
@@ -10653,6 +11603,10 @@
               <w:pStyle w:val="Compact"/>
             </w:pPr>
             <w:r>
+              <w:rPr>
+                <w:sz w:val="16"/>
+                <w:szCs w:val="16"/>
+              </w:rPr>
               <w:t xml:space="preserve">140</w:t>
             </w:r>
           </w:p>
@@ -10664,6 +11618,10 @@
               <w:pStyle w:val="Compact"/>
             </w:pPr>
             <w:r>
+              <w:rPr>
+                <w:sz w:val="16"/>
+                <w:szCs w:val="16"/>
+              </w:rPr>
               <w:t xml:space="preserve">4712.4</w:t>
             </w:r>
           </w:p>
@@ -10675,6 +11633,10 @@
               <w:pStyle w:val="Compact"/>
             </w:pPr>
             <w:r>
+              <w:rPr>
+                <w:sz w:val="16"/>
+                <w:szCs w:val="16"/>
+              </w:rPr>
               <w:t xml:space="preserve">1331.2</w:t>
             </w:r>
           </w:p>
@@ -10686,6 +11648,10 @@
               <w:pStyle w:val="Compact"/>
             </w:pPr>
             <w:r>
+              <w:rPr>
+                <w:sz w:val="16"/>
+                <w:szCs w:val="16"/>
+              </w:rPr>
               <w:t xml:space="preserve">53.15</w:t>
             </w:r>
           </w:p>
@@ -10699,6 +11665,10 @@
               <w:pStyle w:val="Compact"/>
             </w:pPr>
             <w:r>
+              <w:rPr>
+                <w:sz w:val="16"/>
+                <w:szCs w:val="16"/>
+              </w:rPr>
               <w:t xml:space="preserve">23</w:t>
             </w:r>
           </w:p>
@@ -10710,6 +11680,10 @@
               <w:pStyle w:val="Compact"/>
             </w:pPr>
             <w:r>
+              <w:rPr>
+                <w:sz w:val="16"/>
+                <w:szCs w:val="16"/>
+              </w:rPr>
               <w:t xml:space="preserve">160</w:t>
             </w:r>
           </w:p>
@@ -10721,6 +11695,10 @@
               <w:pStyle w:val="Compact"/>
             </w:pPr>
             <w:r>
+              <w:rPr>
+                <w:sz w:val="16"/>
+                <w:szCs w:val="16"/>
+              </w:rPr>
               <w:t xml:space="preserve">15</w:t>
             </w:r>
           </w:p>
@@ -10732,6 +11710,10 @@
               <w:pStyle w:val="Compact"/>
             </w:pPr>
             <w:r>
+              <w:rPr>
+                <w:sz w:val="16"/>
+                <w:szCs w:val="16"/>
+              </w:rPr>
               <w:t xml:space="preserve">130</w:t>
             </w:r>
           </w:p>
@@ -10743,6 +11725,10 @@
               <w:pStyle w:val="Compact"/>
             </w:pPr>
             <w:r>
+              <w:rPr>
+                <w:sz w:val="16"/>
+                <w:szCs w:val="16"/>
+              </w:rPr>
               <w:t xml:space="preserve">6833.0</w:t>
             </w:r>
           </w:p>
@@ -10754,6 +11740,10 @@
               <w:pStyle w:val="Compact"/>
             </w:pPr>
             <w:r>
+              <w:rPr>
+                <w:sz w:val="16"/>
+                <w:szCs w:val="16"/>
+              </w:rPr>
               <w:t xml:space="preserve">1815.0</w:t>
             </w:r>
           </w:p>
@@ -10765,6 +11755,10 @@
               <w:pStyle w:val="Compact"/>
             </w:pPr>
             <w:r>
+              <w:rPr>
+                <w:sz w:val="16"/>
+                <w:szCs w:val="16"/>
+              </w:rPr>
               <w:t xml:space="preserve">51.54</w:t>
             </w:r>
           </w:p>
@@ -10778,6 +11772,10 @@
               <w:pStyle w:val="Compact"/>
             </w:pPr>
             <w:r>
+              <w:rPr>
+                <w:sz w:val="16"/>
+                <w:szCs w:val="16"/>
+              </w:rPr>
               <w:t xml:space="preserve">24</w:t>
             </w:r>
           </w:p>
@@ -10789,6 +11787,10 @@
               <w:pStyle w:val="Compact"/>
             </w:pPr>
             <w:r>
+              <w:rPr>
+                <w:sz w:val="16"/>
+                <w:szCs w:val="16"/>
+              </w:rPr>
               <w:t xml:space="preserve">160</w:t>
             </w:r>
           </w:p>
@@ -10800,6 +11802,10 @@
               <w:pStyle w:val="Compact"/>
             </w:pPr>
             <w:r>
+              <w:rPr>
+                <w:sz w:val="16"/>
+                <w:szCs w:val="16"/>
+              </w:rPr>
               <w:t xml:space="preserve">22</w:t>
             </w:r>
           </w:p>
@@ -10811,6 +11817,10 @@
               <w:pStyle w:val="Compact"/>
             </w:pPr>
             <w:r>
+              <w:rPr>
+                <w:sz w:val="16"/>
+                <w:szCs w:val="16"/>
+              </w:rPr>
               <w:t xml:space="preserve">116</w:t>
             </w:r>
           </w:p>
@@ -10822,6 +11832,10 @@
               <w:pStyle w:val="Compact"/>
             </w:pPr>
             <w:r>
+              <w:rPr>
+                <w:sz w:val="16"/>
+                <w:szCs w:val="16"/>
+              </w:rPr>
               <w:t xml:space="preserve">9537.9</w:t>
             </w:r>
           </w:p>
@@ -10833,6 +11847,10 @@
               <w:pStyle w:val="Compact"/>
             </w:pPr>
             <w:r>
+              <w:rPr>
+                <w:sz w:val="16"/>
+                <w:szCs w:val="16"/>
+              </w:rPr>
               <w:t xml:space="preserve">2328.2</w:t>
             </w:r>
           </w:p>
@@ -10844,6 +11862,10 @@
               <w:pStyle w:val="Compact"/>
             </w:pPr>
             <w:r>
+              <w:rPr>
+                <w:sz w:val="16"/>
+                <w:szCs w:val="16"/>
+              </w:rPr>
               <w:t xml:space="preserve">49.41</w:t>
             </w:r>
           </w:p>
@@ -11946,6 +12968,9 @@
               </m:r>
             </m:sub>
           </m:sSub>
+          <m:r>
+            <m:t xml:space="preserve">  (S23)</m:t>
+          </m:r>
         </m:oMath>
       </m:oMathPara>
     </w:p>
@@ -12332,6 +13357,9 @@
               <m:nor/>
             </m:rPr>
             <m:t>e/kg</m:t>
+          </m:r>
+          <m:r>
+            <m:t xml:space="preserve">  (S24)</m:t>
           </m:r>
         </m:oMath>
       </m:oMathPara>

</xml_diff>